<commit_message>
Polish manager handoff documentation
</commit_message>
<xml_diff>
--- a/fire_weather/docs/research/Fire_Weather_Monitoring_Deep_Dive.docx
+++ b/fire_weather/docs/research/Fire_Weather_Monitoring_Deep_Dive.docx
@@ -3073,19 +3073,7 @@
         <w:rPr/>
       </w:pPr>
       <w:r>
-        <w:rPr>
-          <w:rFonts w:ascii="Georgia" w:cs="Georgia" w:eastAsia="Georgia" w:hAnsi="Georgia"/>
-          <w:color w:val="2c2c2c"/>
-          <w:sz w:val="24"/>
-          <w:szCs w:val="24"/>
-          <w:rtl w:val="0"/>
-        </w:rPr>
-        <w:t xml:space="preserve">Because the data arrives every 10 minutes, a single day contains 144 rows. The analyst resamples to hourly averages for most visualizations. This reduces noise while preserving the diurnal patterns (the daily cycle of rising and falling values) that are central to fire weather analysis.</w:t>
-      </w:r>
-      <w:r>
-        <w:rPr>
-          <w:rtl w:val="0"/>
-        </w:rPr>
+        <w:t>Because the data arrives every 10 minutes, a single day contains 144 rows. The analysis uses hourly medians for most visualizations. Medians reduce short spikes while preserving the daily cycle of rising and falling values that matters for this project.</w:t>
       </w:r>
     </w:p>
     <w:p>
@@ -3279,19 +3267,7 @@
         <w:rPr/>
       </w:pPr>
       <w:r>
-        <w:rPr>
-          <w:rFonts w:ascii="Georgia" w:cs="Georgia" w:eastAsia="Georgia" w:hAnsi="Georgia"/>
-          <w:color w:val="2c2c2c"/>
-          <w:sz w:val="24"/>
-          <w:szCs w:val="24"/>
-          <w:rtl w:val="0"/>
-        </w:rPr>
-        <w:t xml:space="preserve">A fourth combined column, fire_weather_alert, is set to 1 only when all three flags are 1 simultaneously. These alert windows are the output the system communicates to end users.</w:t>
-      </w:r>
-      <w:r>
-        <w:rPr>
-          <w:rtl w:val="0"/>
-        </w:rPr>
+        <w:t>The historical analysis compares these flags to study rare combinations. In the live system, the subscriber separately derives a transparent 0-100 screening score from temperature, humidity, wind, and the synthetic fuel-moisture proxy. No scenario, alert, or severity label is placed in the raw MQTT message.</w:t>
       </w:r>
     </w:p>
     <w:p>
@@ -3390,19 +3366,7 @@
         <w:rPr/>
       </w:pPr>
       <w:r>
-        <w:rPr>
-          <w:rFonts w:ascii="Georgia" w:cs="Georgia" w:eastAsia="Georgia" w:hAnsi="Georgia"/>
-          <w:color w:val="2c2c2c"/>
-          <w:sz w:val="24"/>
-          <w:szCs w:val="24"/>
-          <w:rtl w:val="0"/>
-        </w:rPr>
-        <w:t xml:space="preserve">The analysis groups data by hour of day and calculates the average temperature, humidity, and pressure for each hour across all days in the dataset. This produces an average diurnal profile. For fire weather, the most dangerous window is typically in the early to mid afternoon, when temperatures peak and humidity reaches its daily minimum.</w:t>
-      </w:r>
-      <w:r>
-        <w:rPr>
-          <w:rtl w:val="0"/>
-        </w:rPr>
+        <w:t>The analysis groups data by hour of day and calculates median temperature, humidity, and pressure across the dataset. This produces a typical diurnal profile. In this dataset, the strongest heat-and-dryness overlap appears in the early to mid afternoon, when temperature is highest and humidity is lowest.</w:t>
       </w:r>
     </w:p>
     <w:p>
@@ -3456,19 +3420,7 @@
         <w:rPr/>
       </w:pPr>
       <w:r>
-        <w:rPr>
-          <w:rFonts w:ascii="Georgia" w:cs="Georgia" w:eastAsia="Georgia" w:hAnsi="Georgia"/>
-          <w:color w:val="2c2c2c"/>
-          <w:sz w:val="24"/>
-          <w:szCs w:val="24"/>
-          <w:rtl w:val="0"/>
-        </w:rPr>
-        <w:t xml:space="preserve">The analyst groups data by month and calculates monthly averages and the frequency of high-risk flag activations. This reveals which months carry the highest aggregate fire weather risk for a given location. For most fire-prone regions, summer months produce the longest windows of combined high temperature, low humidity, and wind-driven pressure drops.</w:t>
-      </w:r>
-      <w:r>
-        <w:rPr>
-          <w:rtl w:val="0"/>
-        </w:rPr>
+        <w:t>The analysis groups data by month and compares monthly medians with the frequency of screening-flag activations. For the Jena dataset, this shows a clearer elevated heat-and-dryness baseline in summer. It is a pattern in this weather archive, not a claim about every location.</w:t>
       </w:r>
     </w:p>
     <w:p>
@@ -3604,19 +3556,7 @@
         <w:rPr/>
       </w:pPr>
       <w:r>
-        <w:rPr>
-          <w:rFonts w:ascii="Georgia" w:cs="Georgia" w:eastAsia="Georgia" w:hAnsi="Georgia"/>
-          <w:color w:val="2c2c2c"/>
-          <w:sz w:val="24"/>
-          <w:szCs w:val="24"/>
-          <w:rtl w:val="0"/>
-        </w:rPr>
-        <w:t xml:space="preserve">This chart plots the average hourly value of each variable across the full dataset. Temperature and humidity each get their own line. A second axis shows the frequency of flag activations by hour. The analyst uses this chart to identify the hours of peak risk. The resulting chart typically shows the highest alert frequency in the early to mid afternoon, between roughly 1:00 PM and 5:00 PM local time.</w:t>
-      </w:r>
-      <w:r>
-        <w:rPr>
-          <w:rtl w:val="0"/>
-        </w:rPr>
+        <w:t>This chart plots the median hourly value of each variable across the full dataset. Temperature and humidity each get their own line, and a second axis shows screening-flag frequency by hour. The clearest overlap appears in the early to mid afternoon, roughly 1:00 PM to 4:00 PM in the dataset.</w:t>
       </w:r>
     </w:p>
     <w:p>
@@ -10934,7 +10874,7 @@
         <w:rPr/>
       </w:pPr>
       <w:r>
-        <w:t>On held-out test data, saved model version 2.0.0 recorded R-squared = 0.3189 and mean absolute error = 11.0472 percentage points.</w:t>
+        <w:t>On held-out test data, saved model version 2.0.0 recorded R-squared = 0.3189 and mean absolute error = 11.0472 percentage points. This is a modest baseline result, not a strong operational predictor.</w:t>
       </w:r>
     </w:p>
     <w:p>
@@ -11050,50 +10990,7 @@
         <w:rPr/>
       </w:pPr>
       <w:r>
-        <w:rPr>
-          <w:rtl w:val="0"/>
-        </w:rPr>
-        <w:t>The positive class is extremely rare in the Jena evaluation (0.22%), so the project reports precision, recall, F1, and ROC-AUC instead of relying on accuracy alone.</w:t>
-      </w:r>
-      <w:r>
-        <w:rPr/>
-        <w:drawing>
-          <wp:inline distB="114300" distT="114300" distL="114300" distR="114300">
-            <wp:extent cx="5943600" cy="5219700"/>
-            <wp:effectExtent b="0" l="0" r="0" t="0"/>
-            <wp:docPr id="3" name="image1.png" descr="Confusion matrix for the rare low-humidity classification task."/>
-            <a:graphic>
-              <a:graphicData uri="http://schemas.openxmlformats.org/drawingml/2006/picture">
-                <pic:pic>
-                  <pic:nvPicPr>
-                    <pic:cNvPr id="0" name="image1.png"/>
-                    <pic:cNvPicPr preferRelativeResize="0"/>
-                  </pic:nvPicPr>
-                  <pic:blipFill>
-                    <a:blip r:embed="rId9"/>
-                    <a:srcRect b="0" l="0" r="0" t="0"/>
-                    <a:stretch>
-                      <a:fillRect/>
-                    </a:stretch>
-                  </pic:blipFill>
-                  <pic:spPr>
-                    <a:xfrm>
-                      <a:off x="0" y="0"/>
-                      <a:ext cx="5943600" cy="5219700"/>
-                    </a:xfrm>
-                    <a:prstGeom prst="rect"/>
-                    <a:ln/>
-                  </pic:spPr>
-                </pic:pic>
-              </a:graphicData>
-            </a:graphic>
-          </wp:inline>
-        </w:drawing>
-      </w:r>
-      <w:r>
-        <w:rPr>
-          <w:rtl w:val="0"/>
-        </w:rPr>
+        <w:t>The positive class is extremely rare in the Jena evaluation (0.22%). The saved classifier recorded 0.0909 precision, recall, and F1, with 0.8720 ROC-AUC. Its 0.996 accuracy is mostly class imbalance, so the project does not present accuracy as proof of strong performance.</w:t>
       </w:r>
     </w:p>
     <w:p>
@@ -11152,7 +11049,7 @@
         <w:rPr/>
       </w:pPr>
       <w:r>
-        <w:t>A second logistic-regression pipeline uses temperature and pressure change per hour as an exploratory pressure-risk signal. Pressure is supporting context and does not prove that wind or a wildfire will occur.</w:t>
+        <w:t>A second logistic-regression pipeline uses temperature and pressure change per hour as an exploratory pressure-risk signal. It recorded 0.5608 precision, 0.8004 recall, 0.6595 F1, and 0.9977 ROC-AUC on the packaged evaluation. Pressure remains supporting context and does not prove that wind or a wildfire will occur.</w:t>
       </w:r>
     </w:p>
     <w:p>

</xml_diff>

<commit_message>
Update project documentation and setup
</commit_message>
<xml_diff>
--- a/fire_weather/docs/research/Fire_Weather_Monitoring_Deep_Dive.docx
+++ b/fire_weather/docs/research/Fire_Weather_Monitoring_Deep_Dive.docx
@@ -3073,19 +3073,7 @@
         <w:rPr/>
       </w:pPr>
       <w:r>
-        <w:rPr>
-          <w:rFonts w:ascii="Georgia" w:cs="Georgia" w:eastAsia="Georgia" w:hAnsi="Georgia"/>
-          <w:color w:val="2c2c2c"/>
-          <w:sz w:val="24"/>
-          <w:szCs w:val="24"/>
-          <w:rtl w:val="0"/>
-        </w:rPr>
-        <w:t xml:space="preserve">Because the data arrives every 10 minutes, a single day contains 144 rows. The analyst resamples to hourly averages for most visualizations. This reduces noise while preserving the diurnal patterns (the daily cycle of rising and falling values) that are central to fire weather analysis.</w:t>
-      </w:r>
-      <w:r>
-        <w:rPr>
-          <w:rtl w:val="0"/>
-        </w:rPr>
+        <w:t>Because the data arrives every 10 minutes, a single day contains 144 rows. The analysis uses hourly medians for most visualizations. Medians reduce short spikes while preserving the daily cycle of rising and falling values that matters for this project.</w:t>
       </w:r>
     </w:p>
     <w:p>
@@ -3279,19 +3267,7 @@
         <w:rPr/>
       </w:pPr>
       <w:r>
-        <w:rPr>
-          <w:rFonts w:ascii="Georgia" w:cs="Georgia" w:eastAsia="Georgia" w:hAnsi="Georgia"/>
-          <w:color w:val="2c2c2c"/>
-          <w:sz w:val="24"/>
-          <w:szCs w:val="24"/>
-          <w:rtl w:val="0"/>
-        </w:rPr>
-        <w:t xml:space="preserve">A fourth combined column, fire_weather_alert, is set to 1 only when all three flags are 1 simultaneously. These alert windows are the output the system communicates to end users.</w:t>
-      </w:r>
-      <w:r>
-        <w:rPr>
-          <w:rtl w:val="0"/>
-        </w:rPr>
+        <w:t>The historical analysis compares these flags to study rare combinations. In the live system, the subscriber separately derives a transparent 0-100 screening score from temperature, humidity, wind, and the synthetic fuel-moisture proxy. No scenario, alert, or severity label is placed in the raw MQTT message.</w:t>
       </w:r>
     </w:p>
     <w:p>
@@ -3390,19 +3366,7 @@
         <w:rPr/>
       </w:pPr>
       <w:r>
-        <w:rPr>
-          <w:rFonts w:ascii="Georgia" w:cs="Georgia" w:eastAsia="Georgia" w:hAnsi="Georgia"/>
-          <w:color w:val="2c2c2c"/>
-          <w:sz w:val="24"/>
-          <w:szCs w:val="24"/>
-          <w:rtl w:val="0"/>
-        </w:rPr>
-        <w:t xml:space="preserve">The analysis groups data by hour of day and calculates the average temperature, humidity, and pressure for each hour across all days in the dataset. This produces an average diurnal profile. For fire weather, the most dangerous window is typically in the early to mid afternoon, when temperatures peak and humidity reaches its daily minimum.</w:t>
-      </w:r>
-      <w:r>
-        <w:rPr>
-          <w:rtl w:val="0"/>
-        </w:rPr>
+        <w:t>The analysis groups data by hour of day and calculates median temperature, humidity, and pressure across the dataset. This produces a typical diurnal profile. In this dataset, the strongest heat-and-dryness overlap appears in the early to mid afternoon, when temperature is highest and humidity is lowest.</w:t>
       </w:r>
     </w:p>
     <w:p>
@@ -3456,19 +3420,7 @@
         <w:rPr/>
       </w:pPr>
       <w:r>
-        <w:rPr>
-          <w:rFonts w:ascii="Georgia" w:cs="Georgia" w:eastAsia="Georgia" w:hAnsi="Georgia"/>
-          <w:color w:val="2c2c2c"/>
-          <w:sz w:val="24"/>
-          <w:szCs w:val="24"/>
-          <w:rtl w:val="0"/>
-        </w:rPr>
-        <w:t xml:space="preserve">The analyst groups data by month and calculates monthly averages and the frequency of high-risk flag activations. This reveals which months carry the highest aggregate fire weather risk for a given location. For most fire-prone regions, summer months produce the longest windows of combined high temperature, low humidity, and wind-driven pressure drops.</w:t>
-      </w:r>
-      <w:r>
-        <w:rPr>
-          <w:rtl w:val="0"/>
-        </w:rPr>
+        <w:t>The analysis groups data by month and compares monthly medians with the frequency of screening-flag activations. For the Jena dataset, this shows a clearer elevated heat-and-dryness baseline in summer. It is a pattern in this weather archive, not a claim about every location.</w:t>
       </w:r>
     </w:p>
     <w:p>
@@ -3604,19 +3556,7 @@
         <w:rPr/>
       </w:pPr>
       <w:r>
-        <w:rPr>
-          <w:rFonts w:ascii="Georgia" w:cs="Georgia" w:eastAsia="Georgia" w:hAnsi="Georgia"/>
-          <w:color w:val="2c2c2c"/>
-          <w:sz w:val="24"/>
-          <w:szCs w:val="24"/>
-          <w:rtl w:val="0"/>
-        </w:rPr>
-        <w:t xml:space="preserve">This chart plots the average hourly value of each variable across the full dataset. Temperature and humidity each get their own line. A second axis shows the frequency of flag activations by hour. The analyst uses this chart to identify the hours of peak risk. The resulting chart typically shows the highest alert frequency in the early to mid afternoon, between roughly 1:00 PM and 5:00 PM local time.</w:t>
-      </w:r>
-      <w:r>
-        <w:rPr>
-          <w:rtl w:val="0"/>
-        </w:rPr>
+        <w:t>This chart plots the median hourly value of each variable across the full dataset. Temperature and humidity each get their own line, and a second axis shows screening-flag frequency by hour. The clearest overlap appears in the early to mid afternoon, roughly 1:00 PM to 4:00 PM in the dataset.</w:t>
       </w:r>
     </w:p>
     <w:p>
@@ -10934,7 +10874,7 @@
         <w:rPr/>
       </w:pPr>
       <w:r>
-        <w:t>On held-out test data, saved model version 2.0.0 recorded R-squared = 0.3189 and mean absolute error = 11.0472 percentage points.</w:t>
+        <w:t>On held-out test data, saved model version 2.0.0 recorded R-squared = 0.3189 and mean absolute error = 11.0472 percentage points. This is a modest baseline result, not a strong operational predictor.</w:t>
       </w:r>
     </w:p>
     <w:p>
@@ -11050,50 +10990,7 @@
         <w:rPr/>
       </w:pPr>
       <w:r>
-        <w:rPr>
-          <w:rtl w:val="0"/>
-        </w:rPr>
-        <w:t>The positive class is extremely rare in the Jena evaluation (0.22%), so the project reports precision, recall, F1, and ROC-AUC instead of relying on accuracy alone.</w:t>
-      </w:r>
-      <w:r>
-        <w:rPr/>
-        <w:drawing>
-          <wp:inline distB="114300" distT="114300" distL="114300" distR="114300">
-            <wp:extent cx="5943600" cy="5219700"/>
-            <wp:effectExtent b="0" l="0" r="0" t="0"/>
-            <wp:docPr id="3" name="image1.png" descr="Confusion matrix for the rare low-humidity classification task."/>
-            <a:graphic>
-              <a:graphicData uri="http://schemas.openxmlformats.org/drawingml/2006/picture">
-                <pic:pic>
-                  <pic:nvPicPr>
-                    <pic:cNvPr id="0" name="image1.png"/>
-                    <pic:cNvPicPr preferRelativeResize="0"/>
-                  </pic:nvPicPr>
-                  <pic:blipFill>
-                    <a:blip r:embed="rId9"/>
-                    <a:srcRect b="0" l="0" r="0" t="0"/>
-                    <a:stretch>
-                      <a:fillRect/>
-                    </a:stretch>
-                  </pic:blipFill>
-                  <pic:spPr>
-                    <a:xfrm>
-                      <a:off x="0" y="0"/>
-                      <a:ext cx="5943600" cy="5219700"/>
-                    </a:xfrm>
-                    <a:prstGeom prst="rect"/>
-                    <a:ln/>
-                  </pic:spPr>
-                </pic:pic>
-              </a:graphicData>
-            </a:graphic>
-          </wp:inline>
-        </w:drawing>
-      </w:r>
-      <w:r>
-        <w:rPr>
-          <w:rtl w:val="0"/>
-        </w:rPr>
+        <w:t>The positive class is extremely rare in the Jena evaluation (0.22%). The saved classifier recorded 0.0909 precision, recall, and F1, with 0.8720 ROC-AUC. Its 0.996 accuracy is mostly class imbalance, so the project does not present accuracy as proof of strong performance.</w:t>
       </w:r>
     </w:p>
     <w:p>
@@ -11152,7 +11049,7 @@
         <w:rPr/>
       </w:pPr>
       <w:r>
-        <w:t>A second logistic-regression pipeline uses temperature and pressure change per hour as an exploratory pressure-risk signal. Pressure is supporting context and does not prove that wind or a wildfire will occur.</w:t>
+        <w:t>A second logistic-regression pipeline uses temperature and pressure change per hour as an exploratory pressure-risk signal. It recorded 0.5608 precision, 0.8004 recall, 0.6595 F1, and 0.9977 ROC-AUC on the packaged evaluation. Pressure remains supporting context and does not prove that wind or a wildfire will occur.</w:t>
       </w:r>
     </w:p>
     <w:p>

</xml_diff>

<commit_message>
Update Fire Weather research report
</commit_message>
<xml_diff>
--- a/fire_weather/docs/research/Fire_Weather_Monitoring_Deep_Dive.docx
+++ b/fire_weather/docs/research/Fire_Weather_Monitoring_Deep_Dive.docx
@@ -126,12 +126,42 @@
     <w:p>
       <w:pPr>
         <w:spacing w:after="600" w:lineRule="auto"/>
-        <w:rPr/>
-      </w:pPr>
-      <w:r>
-        <w:rPr>
-          <w:rtl w:val="0"/>
-        </w:rPr>
+        <w:jc w:val="center"/>
+        <w:rPr/>
+      </w:pPr>
+      <w:r/>
+      <w:r>
+        <w:rPr>
+          <w:rFonts w:ascii="Arial" w:hAnsi="Arial"/>
+          <w:sz w:val="22"/>
+        </w:rPr>
+        <w:t>Advisor: G. Venkat</w:t>
+      </w:r>
+    </w:p>
+    <w:p>
+      <w:pPr>
+        <w:jc w:val="center"/>
+      </w:pPr>
+      <w:r/>
+      <w:r>
+        <w:rPr>
+          <w:rFonts w:ascii="Arial" w:hAnsi="Arial"/>
+          <w:sz w:val="22"/>
+        </w:rPr>
+        <w:t>Research conducted under guidance from byteSmart</w:t>
+      </w:r>
+    </w:p>
+    <w:p>
+      <w:pPr>
+        <w:jc w:val="center"/>
+      </w:pPr>
+      <w:r/>
+      <w:r>
+        <w:rPr>
+          <w:rFonts w:ascii="Arial" w:hAnsi="Arial"/>
+          <w:sz w:val="22"/>
+        </w:rPr>
+        <w:t>June 22 to August 7, 2026</w:t>
       </w:r>
     </w:p>
     <w:p>
@@ -180,6 +210,24 @@
     <w:p>
       <w:pPr>
         <w:pStyle w:val="Heading1"/>
+      </w:pPr>
+      <w:r>
+        <w:t>Acknowledgement</w:t>
+      </w:r>
+    </w:p>
+    <w:p>
+      <w:r/>
+      <w:r>
+        <w:rPr>
+          <w:rFonts w:ascii="Georgia" w:hAnsi="Georgia"/>
+          <w:sz w:val="24"/>
+        </w:rPr>
+        <w:t>Event Generator code, dashboard code, database schema, installation procedures, tools, Arduino hardware, and other scripts used were provided by byteSmart. Code was enhanced by AI and deployed. Initial datasets were taken from the public domain, including the Weather Archive Jena Dataset hosted on Kaggle: https://www.kaggle.com/datasets/pankrzysiu/weather-archive-jena.</w:t>
+      </w:r>
+    </w:p>
+    <w:p>
+      <w:pPr>
+        <w:pStyle w:val="Heading1"/>
         <w:spacing w:after="120" w:before="360" w:lineRule="auto"/>
         <w:rPr/>
       </w:pPr>
@@ -199,6 +247,12 @@
         <w:rPr>
           <w:rtl w:val="0"/>
         </w:rPr>
+      </w:r>
+    </w:p>
+    <w:p>
+      <w:pPr/>
+      <w:r>
+        <w:t>Acknowledgement</w:t>
       </w:r>
     </w:p>
     <w:p>
@@ -11908,29 +11962,6 @@
         <w:spacing w:after="400" w:lineRule="auto"/>
         <w:rPr/>
       </w:pPr>
-      <w:r>
-        <w:rPr>
-          <w:rtl w:val="0"/>
-        </w:rPr>
-      </w:r>
-    </w:p>
-    <w:p>
-      <w:pPr>
-        <w:jc w:val="center"/>
-        <w:rPr/>
-      </w:pPr>
-      <w:r>
-        <w:rPr>
-          <w:rFonts w:ascii="Arial" w:cs="Arial" w:eastAsia="Arial" w:hAnsi="Arial"/>
-          <w:i w:val="1"/>
-          <w:iCs w:val="1"/>
-          <w:color w:val="555555"/>
-          <w:sz w:val="20"/>
-          <w:szCs w:val="20"/>
-          <w:rtl w:val="0"/>
-        </w:rPr>
-        <w:t xml:space="preserve">End of Report</w:t>
-      </w:r>
       <w:r>
         <w:rPr>
           <w:rtl w:val="0"/>

</xml_diff>